<commit_message>
Add VIIRS nighttime lights panel and QC outputs
</commit_message>
<xml_diff>
--- a/Bel1.docx
+++ b/Bel1.docx
@@ -4,6 +4,10 @@
   <w:body>
     <w:p>
       <w:r>
+        <w:rPr>
+          <w:noProof/>
+          <w:lang w:eastAsia="tr-TR"/>
+        </w:rPr>
         <w:drawing>
           <wp:inline distT="0" distB="0" distL="0" distR="0" wp14:anchorId="5A9D2177" wp14:editId="2F8C9CB6">
             <wp:extent cx="5760720" cy="7000875"/>
@@ -40,6 +44,1606 @@
           </wp:inline>
         </w:drawing>
       </w:r>
+    </w:p>
+    <w:p>
+      <w:proofErr w:type="spellStart"/>
+      <w:r>
+        <w:t>The</w:t>
+      </w:r>
+      <w:proofErr w:type="spellEnd"/>
+      <w:r>
+        <w:t xml:space="preserve"> main </w:t>
+      </w:r>
+      <w:proofErr w:type="spellStart"/>
+      <w:r>
+        <w:t>analysis</w:t>
+      </w:r>
+      <w:proofErr w:type="spellEnd"/>
+      <w:r>
+        <w:t xml:space="preserve"> </w:t>
+      </w:r>
+      <w:proofErr w:type="spellStart"/>
+      <w:r>
+        <w:t>retains</w:t>
+      </w:r>
+      <w:proofErr w:type="spellEnd"/>
+      <w:r>
+        <w:t xml:space="preserve"> 1 × 1 km </w:t>
+      </w:r>
+      <w:proofErr w:type="spellStart"/>
+      <w:r>
+        <w:t>grid</w:t>
+      </w:r>
+      <w:proofErr w:type="spellEnd"/>
+      <w:r>
+        <w:t xml:space="preserve"> </w:t>
+      </w:r>
+      <w:proofErr w:type="spellStart"/>
+      <w:r>
+        <w:t>cells</w:t>
+      </w:r>
+      <w:proofErr w:type="spellEnd"/>
+      <w:r>
+        <w:t xml:space="preserve"> </w:t>
+      </w:r>
+      <w:proofErr w:type="spellStart"/>
+      <w:r>
+        <w:t>whose</w:t>
+      </w:r>
+      <w:proofErr w:type="spellEnd"/>
+      <w:r>
+        <w:t xml:space="preserve"> </w:t>
+      </w:r>
+      <w:proofErr w:type="spellStart"/>
+      <w:r>
+        <w:t>centroids</w:t>
+      </w:r>
+      <w:proofErr w:type="spellEnd"/>
+      <w:r>
+        <w:t xml:space="preserve"> </w:t>
+      </w:r>
+      <w:proofErr w:type="spellStart"/>
+      <w:r>
+        <w:t>fall</w:t>
+      </w:r>
+      <w:proofErr w:type="spellEnd"/>
+      <w:r>
+        <w:t xml:space="preserve"> </w:t>
+      </w:r>
+      <w:proofErr w:type="spellStart"/>
+      <w:r>
+        <w:t>within</w:t>
+      </w:r>
+      <w:proofErr w:type="spellEnd"/>
+      <w:r>
+        <w:t xml:space="preserve"> </w:t>
+      </w:r>
+      <w:proofErr w:type="spellStart"/>
+      <w:r>
+        <w:t>the</w:t>
+      </w:r>
+      <w:proofErr w:type="spellEnd"/>
+      <w:r>
+        <w:t xml:space="preserve"> </w:t>
+      </w:r>
+      <w:proofErr w:type="spellStart"/>
+      <w:r>
+        <w:t>study-area</w:t>
+      </w:r>
+      <w:proofErr w:type="spellEnd"/>
+      <w:r>
+        <w:t xml:space="preserve"> </w:t>
+      </w:r>
+      <w:proofErr w:type="spellStart"/>
+      <w:r>
+        <w:t>boundary</w:t>
+      </w:r>
+      <w:proofErr w:type="spellEnd"/>
+      <w:r>
+        <w:t xml:space="preserve">. As a </w:t>
+      </w:r>
+      <w:proofErr w:type="spellStart"/>
+      <w:r>
+        <w:t>robustness</w:t>
+      </w:r>
+      <w:proofErr w:type="spellEnd"/>
+      <w:r>
+        <w:t xml:space="preserve"> </w:t>
+      </w:r>
+      <w:proofErr w:type="spellStart"/>
+      <w:r>
+        <w:t>check</w:t>
+      </w:r>
+      <w:proofErr w:type="spellEnd"/>
+      <w:r>
+        <w:t xml:space="preserve">, </w:t>
+      </w:r>
+      <w:proofErr w:type="spellStart"/>
+      <w:r>
+        <w:t>the</w:t>
+      </w:r>
+      <w:proofErr w:type="spellEnd"/>
+      <w:r>
+        <w:t xml:space="preserve"> </w:t>
+      </w:r>
+      <w:proofErr w:type="spellStart"/>
+      <w:r>
+        <w:t>sample</w:t>
+      </w:r>
+      <w:proofErr w:type="spellEnd"/>
+      <w:r>
+        <w:t xml:space="preserve"> is </w:t>
+      </w:r>
+      <w:proofErr w:type="spellStart"/>
+      <w:r>
+        <w:t>alternatively</w:t>
+      </w:r>
+      <w:proofErr w:type="spellEnd"/>
+      <w:r>
+        <w:t xml:space="preserve"> </w:t>
+      </w:r>
+      <w:proofErr w:type="spellStart"/>
+      <w:r>
+        <w:t>defined</w:t>
+      </w:r>
+      <w:proofErr w:type="spellEnd"/>
+      <w:r>
+        <w:t xml:space="preserve"> </w:t>
+      </w:r>
+      <w:proofErr w:type="spellStart"/>
+      <w:r>
+        <w:t>using</w:t>
+      </w:r>
+      <w:proofErr w:type="spellEnd"/>
+      <w:r>
+        <w:t xml:space="preserve"> </w:t>
+      </w:r>
+      <w:proofErr w:type="spellStart"/>
+      <w:r>
+        <w:t>the</w:t>
+      </w:r>
+      <w:proofErr w:type="spellEnd"/>
+      <w:r>
+        <w:t xml:space="preserve"> </w:t>
+      </w:r>
+      <w:proofErr w:type="spellStart"/>
+      <w:r>
+        <w:t>proportion</w:t>
+      </w:r>
+      <w:proofErr w:type="spellEnd"/>
+      <w:r>
+        <w:t xml:space="preserve"> of </w:t>
+      </w:r>
+      <w:proofErr w:type="spellStart"/>
+      <w:r>
+        <w:t>each</w:t>
+      </w:r>
+      <w:proofErr w:type="spellEnd"/>
+      <w:r>
+        <w:t xml:space="preserve"> </w:t>
+      </w:r>
+      <w:proofErr w:type="spellStart"/>
+      <w:r>
+        <w:t>grid</w:t>
+      </w:r>
+      <w:proofErr w:type="spellEnd"/>
+      <w:r>
+        <w:t xml:space="preserve"> </w:t>
+      </w:r>
+      <w:proofErr w:type="spellStart"/>
+      <w:r>
+        <w:t>cell</w:t>
+      </w:r>
+      <w:proofErr w:type="spellEnd"/>
+      <w:r>
+        <w:t xml:space="preserve"> </w:t>
+      </w:r>
+      <w:proofErr w:type="spellStart"/>
+      <w:r>
+        <w:t>located</w:t>
+      </w:r>
+      <w:proofErr w:type="spellEnd"/>
+      <w:r>
+        <w:t xml:space="preserve"> </w:t>
+      </w:r>
+      <w:proofErr w:type="spellStart"/>
+      <w:r>
+        <w:t>within</w:t>
+      </w:r>
+      <w:proofErr w:type="spellEnd"/>
+      <w:r>
+        <w:t xml:space="preserve"> </w:t>
+      </w:r>
+      <w:proofErr w:type="spellStart"/>
+      <w:r>
+        <w:t>the</w:t>
+      </w:r>
+      <w:proofErr w:type="spellEnd"/>
+      <w:r>
+        <w:t xml:space="preserve"> </w:t>
+      </w:r>
+      <w:proofErr w:type="spellStart"/>
+      <w:r>
+        <w:t>study</w:t>
+      </w:r>
+      <w:proofErr w:type="spellEnd"/>
+      <w:r>
+        <w:t xml:space="preserve"> </w:t>
+      </w:r>
+      <w:proofErr w:type="spellStart"/>
+      <w:r>
+        <w:t>region</w:t>
+      </w:r>
+      <w:proofErr w:type="spellEnd"/>
+      <w:r>
+        <w:t xml:space="preserve">, </w:t>
+      </w:r>
+      <w:proofErr w:type="spellStart"/>
+      <w:r>
+        <w:t>with</w:t>
+      </w:r>
+      <w:proofErr w:type="spellEnd"/>
+      <w:r>
+        <w:t xml:space="preserve"> a 50% </w:t>
+      </w:r>
+      <w:proofErr w:type="spellStart"/>
+      <w:r>
+        <w:t>inclusion</w:t>
+      </w:r>
+      <w:proofErr w:type="spellEnd"/>
+      <w:r>
+        <w:t xml:space="preserve"> </w:t>
+      </w:r>
+      <w:proofErr w:type="spellStart"/>
+      <w:r>
+        <w:t>threshold</w:t>
+      </w:r>
+      <w:proofErr w:type="spellEnd"/>
+      <w:r>
+        <w:t>.</w:t>
+      </w:r>
+    </w:p>
+    <w:p>
+      <w:proofErr w:type="spellStart"/>
+      <w:r>
+        <w:t>The</w:t>
+      </w:r>
+      <w:proofErr w:type="spellEnd"/>
+      <w:r>
+        <w:t xml:space="preserve"> </w:t>
+      </w:r>
+      <w:proofErr w:type="spellStart"/>
+      <w:r>
+        <w:t>two</w:t>
+      </w:r>
+      <w:proofErr w:type="spellEnd"/>
+      <w:r>
+        <w:t xml:space="preserve"> </w:t>
+      </w:r>
+      <w:proofErr w:type="spellStart"/>
+      <w:r>
+        <w:t>definitions</w:t>
+      </w:r>
+      <w:proofErr w:type="spellEnd"/>
+      <w:r>
+        <w:t xml:space="preserve"> </w:t>
+      </w:r>
+      <w:proofErr w:type="spellStart"/>
+      <w:r>
+        <w:t>yield</w:t>
+      </w:r>
+      <w:proofErr w:type="spellEnd"/>
+      <w:r>
+        <w:t xml:space="preserve"> </w:t>
+      </w:r>
+      <w:proofErr w:type="spellStart"/>
+      <w:r>
+        <w:t>nearly</w:t>
+      </w:r>
+      <w:proofErr w:type="spellEnd"/>
+      <w:r>
+        <w:t xml:space="preserve"> </w:t>
+      </w:r>
+      <w:proofErr w:type="spellStart"/>
+      <w:r>
+        <w:t>identical</w:t>
+      </w:r>
+      <w:proofErr w:type="spellEnd"/>
+      <w:r>
+        <w:t xml:space="preserve"> </w:t>
+      </w:r>
+      <w:proofErr w:type="spellStart"/>
+      <w:r>
+        <w:t>samples</w:t>
+      </w:r>
+      <w:proofErr w:type="spellEnd"/>
+      <w:r>
+        <w:t xml:space="preserve">, </w:t>
+      </w:r>
+      <w:proofErr w:type="spellStart"/>
+      <w:r>
+        <w:t>differing</w:t>
+      </w:r>
+      <w:proofErr w:type="spellEnd"/>
+      <w:r>
+        <w:t xml:space="preserve"> </w:t>
+      </w:r>
+      <w:proofErr w:type="spellStart"/>
+      <w:r>
+        <w:t>by</w:t>
+      </w:r>
+      <w:proofErr w:type="spellEnd"/>
+      <w:r>
+        <w:t xml:space="preserve"> </w:t>
+      </w:r>
+      <w:proofErr w:type="spellStart"/>
+      <w:r>
+        <w:t>only</w:t>
+      </w:r>
+      <w:proofErr w:type="spellEnd"/>
+      <w:r>
+        <w:t xml:space="preserve"> seven </w:t>
+      </w:r>
+      <w:proofErr w:type="spellStart"/>
+      <w:r>
+        <w:t>grid</w:t>
+      </w:r>
+      <w:proofErr w:type="spellEnd"/>
+      <w:r>
+        <w:t xml:space="preserve"> </w:t>
+      </w:r>
+      <w:proofErr w:type="spellStart"/>
+      <w:r>
+        <w:t>cells</w:t>
+      </w:r>
+      <w:proofErr w:type="spellEnd"/>
+      <w:r>
+        <w:t>.</w:t>
+      </w:r>
+    </w:p>
+    <w:p>
+      <w:pPr>
+        <w:spacing w:before="100" w:beforeAutospacing="1" w:after="100" w:afterAutospacing="1" w:line="240" w:lineRule="auto"/>
+        <w:rPr>
+          <w:rFonts w:ascii="Times New Roman" w:eastAsia="Times New Roman" w:hAnsi="Times New Roman" w:cs="Times New Roman"/>
+          <w:sz w:val="24"/>
+          <w:szCs w:val="24"/>
+          <w:lang w:eastAsia="tr-TR"/>
+        </w:rPr>
+      </w:pPr>
+      <w:r>
+        <w:rPr>
+          <w:rFonts w:ascii="Courier New" w:eastAsia="Times New Roman" w:hAnsi="Courier New" w:cs="Courier New"/>
+          <w:sz w:val="20"/>
+          <w:szCs w:val="20"/>
+          <w:lang w:eastAsia="tr-TR"/>
+        </w:rPr>
+        <w:t>03_border_</w:t>
+      </w:r>
+      <w:proofErr w:type="gramStart"/>
+      <w:r>
+        <w:rPr>
+          <w:rFonts w:ascii="Courier New" w:eastAsia="Times New Roman" w:hAnsi="Courier New" w:cs="Courier New"/>
+          <w:sz w:val="20"/>
+          <w:szCs w:val="20"/>
+          <w:lang w:eastAsia="tr-TR"/>
+        </w:rPr>
+        <w:t>accessibility.ipynb</w:t>
+      </w:r>
+      <w:proofErr w:type="gramEnd"/>
+      <w:r>
+        <w:rPr>
+          <w:rFonts w:ascii="Times New Roman" w:eastAsia="Times New Roman" w:hAnsi="Times New Roman" w:cs="Times New Roman"/>
+          <w:sz w:val="24"/>
+          <w:szCs w:val="24"/>
+          <w:lang w:eastAsia="tr-TR"/>
+        </w:rPr>
+        <w:t xml:space="preserve"> “hangi sınır kapıları çalışma kapsamına giriyor?” </w:t>
+      </w:r>
+      <w:proofErr w:type="spellStart"/>
+      <w:r>
+        <w:rPr>
+          <w:rFonts w:ascii="Times New Roman" w:eastAsia="Times New Roman" w:hAnsi="Times New Roman" w:cs="Times New Roman"/>
+          <w:sz w:val="24"/>
+          <w:szCs w:val="24"/>
+          <w:lang w:eastAsia="tr-TR"/>
+        </w:rPr>
+        <w:t>grid</w:t>
+      </w:r>
+      <w:proofErr w:type="spellEnd"/>
+      <w:r>
+        <w:rPr>
+          <w:rFonts w:ascii="Times New Roman" w:eastAsia="Times New Roman" w:hAnsi="Times New Roman" w:cs="Times New Roman"/>
+          <w:sz w:val="24"/>
+          <w:szCs w:val="24"/>
+          <w:lang w:eastAsia="tr-TR"/>
+        </w:rPr>
+        <w:t xml:space="preserve"> erişilebilirlik değişkenlerini </w:t>
+      </w:r>
+    </w:p>
+    <w:p>
+      <w:pPr>
+        <w:spacing w:before="100" w:beforeAutospacing="1" w:after="100" w:afterAutospacing="1" w:line="240" w:lineRule="auto"/>
+        <w:rPr>
+          <w:rFonts w:ascii="Times New Roman" w:eastAsia="Times New Roman" w:hAnsi="Times New Roman" w:cs="Times New Roman"/>
+          <w:sz w:val="24"/>
+          <w:szCs w:val="24"/>
+          <w:lang w:eastAsia="tr-TR"/>
+        </w:rPr>
+      </w:pPr>
+      <w:r>
+        <w:rPr>
+          <w:rFonts w:ascii="Times New Roman" w:eastAsia="Times New Roman" w:hAnsi="Times New Roman" w:cs="Times New Roman"/>
+          <w:sz w:val="24"/>
+          <w:szCs w:val="24"/>
+          <w:lang w:eastAsia="tr-TR"/>
+        </w:rPr>
+        <w:lastRenderedPageBreak/>
+        <w:t xml:space="preserve">Türkiye’nin Avrupa kara sınırındaki bu çalışma için resmi Ticaret Bakanlığı kaynakları Bulgaristan tarafında Kapıkule, Hamzabeyli ve </w:t>
+      </w:r>
+      <w:proofErr w:type="spellStart"/>
+      <w:r>
+        <w:rPr>
+          <w:rFonts w:ascii="Times New Roman" w:eastAsia="Times New Roman" w:hAnsi="Times New Roman" w:cs="Times New Roman"/>
+          <w:sz w:val="24"/>
+          <w:szCs w:val="24"/>
+          <w:lang w:eastAsia="tr-TR"/>
+        </w:rPr>
+        <w:t>Dereköy</w:t>
+      </w:r>
+      <w:proofErr w:type="spellEnd"/>
+      <w:r>
+        <w:rPr>
+          <w:rFonts w:ascii="Times New Roman" w:eastAsia="Times New Roman" w:hAnsi="Times New Roman" w:cs="Times New Roman"/>
+          <w:sz w:val="24"/>
+          <w:szCs w:val="24"/>
+          <w:lang w:eastAsia="tr-TR"/>
+        </w:rPr>
+        <w:t xml:space="preserve">; Yunanistan tarafında </w:t>
+      </w:r>
+      <w:proofErr w:type="spellStart"/>
+      <w:r>
+        <w:rPr>
+          <w:rFonts w:ascii="Times New Roman" w:eastAsia="Times New Roman" w:hAnsi="Times New Roman" w:cs="Times New Roman"/>
+          <w:sz w:val="24"/>
+          <w:szCs w:val="24"/>
+          <w:lang w:eastAsia="tr-TR"/>
+        </w:rPr>
+        <w:t>Pazarkule</w:t>
+      </w:r>
+      <w:proofErr w:type="spellEnd"/>
+      <w:r>
+        <w:rPr>
+          <w:rFonts w:ascii="Times New Roman" w:eastAsia="Times New Roman" w:hAnsi="Times New Roman" w:cs="Times New Roman"/>
+          <w:sz w:val="24"/>
+          <w:szCs w:val="24"/>
+          <w:lang w:eastAsia="tr-TR"/>
+        </w:rPr>
+        <w:t xml:space="preserve"> ve İpsala kapılarını gösteriyor. </w:t>
+      </w:r>
+    </w:p>
+    <w:p>
+      <w:pPr>
+        <w:spacing w:before="100" w:beforeAutospacing="1" w:after="100" w:afterAutospacing="1" w:line="240" w:lineRule="auto"/>
+        <w:rPr>
+          <w:rFonts w:ascii="Times New Roman" w:eastAsia="Times New Roman" w:hAnsi="Times New Roman" w:cs="Times New Roman"/>
+          <w:sz w:val="24"/>
+          <w:szCs w:val="24"/>
+          <w:lang w:eastAsia="tr-TR"/>
+        </w:rPr>
+      </w:pPr>
+      <w:r>
+        <w:rPr>
+          <w:rFonts w:ascii="Times New Roman" w:eastAsia="Times New Roman" w:hAnsi="Times New Roman" w:cs="Times New Roman"/>
+          <w:sz w:val="24"/>
+          <w:szCs w:val="24"/>
+          <w:lang w:eastAsia="tr-TR"/>
+        </w:rPr>
+        <w:t xml:space="preserve">Önemli bir güncel ayrıntı da var: </w:t>
+      </w:r>
+      <w:proofErr w:type="spellStart"/>
+      <w:r>
+        <w:rPr>
+          <w:rFonts w:ascii="Times New Roman" w:eastAsia="Times New Roman" w:hAnsi="Times New Roman" w:cs="Times New Roman"/>
+          <w:sz w:val="24"/>
+          <w:szCs w:val="24"/>
+          <w:lang w:eastAsia="tr-TR"/>
+        </w:rPr>
+        <w:t>Dereköy</w:t>
+      </w:r>
+      <w:proofErr w:type="spellEnd"/>
+      <w:r>
+        <w:rPr>
+          <w:rFonts w:ascii="Times New Roman" w:eastAsia="Times New Roman" w:hAnsi="Times New Roman" w:cs="Times New Roman"/>
+          <w:sz w:val="24"/>
+          <w:szCs w:val="24"/>
+          <w:lang w:eastAsia="tr-TR"/>
+        </w:rPr>
+        <w:t xml:space="preserve"> kapısı 3 Ağustos 2026’dan itibaren 3,5 tona kadar hafif ticari kargo araçlarına da açıldı; dolayısıyla 2014–2025 tarihsel analizinizde kapının işlevsel kapasitesi dönem boyunca aynı değil. Bu nedenle ileride “</w:t>
+      </w:r>
+      <w:proofErr w:type="spellStart"/>
+      <w:r>
+        <w:rPr>
+          <w:rFonts w:ascii="Times New Roman" w:eastAsia="Times New Roman" w:hAnsi="Times New Roman" w:cs="Times New Roman"/>
+          <w:sz w:val="24"/>
+          <w:szCs w:val="24"/>
+          <w:lang w:eastAsia="tr-TR"/>
+        </w:rPr>
+        <w:t>gate</w:t>
+      </w:r>
+      <w:proofErr w:type="spellEnd"/>
+      <w:r>
+        <w:rPr>
+          <w:rFonts w:ascii="Times New Roman" w:eastAsia="Times New Roman" w:hAnsi="Times New Roman" w:cs="Times New Roman"/>
+          <w:sz w:val="24"/>
+          <w:szCs w:val="24"/>
+          <w:lang w:eastAsia="tr-TR"/>
+        </w:rPr>
+        <w:t xml:space="preserve"> </w:t>
+      </w:r>
+      <w:proofErr w:type="spellStart"/>
+      <w:r>
+        <w:rPr>
+          <w:rFonts w:ascii="Times New Roman" w:eastAsia="Times New Roman" w:hAnsi="Times New Roman" w:cs="Times New Roman"/>
+          <w:sz w:val="24"/>
+          <w:szCs w:val="24"/>
+          <w:lang w:eastAsia="tr-TR"/>
+        </w:rPr>
+        <w:t>type</w:t>
+      </w:r>
+      <w:proofErr w:type="spellEnd"/>
+      <w:r>
+        <w:rPr>
+          <w:rFonts w:ascii="Times New Roman" w:eastAsia="Times New Roman" w:hAnsi="Times New Roman" w:cs="Times New Roman"/>
+          <w:sz w:val="24"/>
+          <w:szCs w:val="24"/>
+          <w:lang w:eastAsia="tr-TR"/>
+        </w:rPr>
+        <w:t>/</w:t>
+      </w:r>
+      <w:proofErr w:type="spellStart"/>
+      <w:r>
+        <w:rPr>
+          <w:rFonts w:ascii="Times New Roman" w:eastAsia="Times New Roman" w:hAnsi="Times New Roman" w:cs="Times New Roman"/>
+          <w:sz w:val="24"/>
+          <w:szCs w:val="24"/>
+          <w:lang w:eastAsia="tr-TR"/>
+        </w:rPr>
+        <w:t>capacity</w:t>
+      </w:r>
+      <w:proofErr w:type="spellEnd"/>
+      <w:r>
+        <w:rPr>
+          <w:rFonts w:ascii="Times New Roman" w:eastAsia="Times New Roman" w:hAnsi="Times New Roman" w:cs="Times New Roman"/>
+          <w:sz w:val="24"/>
+          <w:szCs w:val="24"/>
+          <w:lang w:eastAsia="tr-TR"/>
+        </w:rPr>
+        <w:t xml:space="preserve"> </w:t>
+      </w:r>
+      <w:proofErr w:type="spellStart"/>
+      <w:r>
+        <w:rPr>
+          <w:rFonts w:ascii="Times New Roman" w:eastAsia="Times New Roman" w:hAnsi="Times New Roman" w:cs="Times New Roman"/>
+          <w:sz w:val="24"/>
+          <w:szCs w:val="24"/>
+          <w:lang w:eastAsia="tr-TR"/>
+        </w:rPr>
+        <w:t>over</w:t>
+      </w:r>
+      <w:proofErr w:type="spellEnd"/>
+      <w:r>
+        <w:rPr>
+          <w:rFonts w:ascii="Times New Roman" w:eastAsia="Times New Roman" w:hAnsi="Times New Roman" w:cs="Times New Roman"/>
+          <w:sz w:val="24"/>
+          <w:szCs w:val="24"/>
+          <w:lang w:eastAsia="tr-TR"/>
+        </w:rPr>
+        <w:t xml:space="preserve"> time” için </w:t>
+      </w:r>
+      <w:proofErr w:type="spellStart"/>
+      <w:r>
+        <w:rPr>
+          <w:rFonts w:ascii="Times New Roman" w:eastAsia="Times New Roman" w:hAnsi="Times New Roman" w:cs="Times New Roman"/>
+          <w:sz w:val="24"/>
+          <w:szCs w:val="24"/>
+          <w:lang w:eastAsia="tr-TR"/>
+        </w:rPr>
+        <w:t>sensitivity</w:t>
+      </w:r>
+      <w:proofErr w:type="spellEnd"/>
+      <w:r>
+        <w:rPr>
+          <w:rFonts w:ascii="Times New Roman" w:eastAsia="Times New Roman" w:hAnsi="Times New Roman" w:cs="Times New Roman"/>
+          <w:sz w:val="24"/>
+          <w:szCs w:val="24"/>
+          <w:lang w:eastAsia="tr-TR"/>
+        </w:rPr>
+        <w:t xml:space="preserve"> analizi düşünmek faydalı olabilir. Ama ana </w:t>
+      </w:r>
+      <w:proofErr w:type="spellStart"/>
+      <w:r>
+        <w:rPr>
+          <w:rFonts w:ascii="Times New Roman" w:eastAsia="Times New Roman" w:hAnsi="Times New Roman" w:cs="Times New Roman"/>
+          <w:sz w:val="24"/>
+          <w:szCs w:val="24"/>
+          <w:lang w:eastAsia="tr-TR"/>
+        </w:rPr>
+        <w:t>treatment</w:t>
+      </w:r>
+      <w:proofErr w:type="spellEnd"/>
+      <w:r>
+        <w:rPr>
+          <w:rFonts w:ascii="Times New Roman" w:eastAsia="Times New Roman" w:hAnsi="Times New Roman" w:cs="Times New Roman"/>
+          <w:sz w:val="24"/>
+          <w:szCs w:val="24"/>
+          <w:lang w:eastAsia="tr-TR"/>
+        </w:rPr>
+        <w:t xml:space="preserve"> değişkenini önce coğrafi erişilebilirlik olarak kuracağız.</w:t>
+      </w:r>
+    </w:p>
+    <w:p>
+      <w:r>
+        <w:drawing>
+          <wp:inline distT="0" distB="0" distL="0" distR="0" wp14:anchorId="7C5D0B95" wp14:editId="059E73C2">
+            <wp:extent cx="5760720" cy="1428115"/>
+            <wp:effectExtent l="0" t="0" r="0" b="635"/>
+            <wp:docPr id="2" name="Resim 2"/>
+            <wp:cNvGraphicFramePr>
+              <a:graphicFrameLocks xmlns:a="http://schemas.openxmlformats.org/drawingml/2006/main" noChangeAspect="1"/>
+            </wp:cNvGraphicFramePr>
+            <a:graphic xmlns:a="http://schemas.openxmlformats.org/drawingml/2006/main">
+              <a:graphicData uri="http://schemas.openxmlformats.org/drawingml/2006/picture">
+                <pic:pic xmlns:pic="http://schemas.openxmlformats.org/drawingml/2006/picture">
+                  <pic:nvPicPr>
+                    <pic:cNvPr id="1" name=""/>
+                    <pic:cNvPicPr/>
+                  </pic:nvPicPr>
+                  <pic:blipFill>
+                    <a:blip r:embed="rId5"/>
+                    <a:stretch>
+                      <a:fillRect/>
+                    </a:stretch>
+                  </pic:blipFill>
+                  <pic:spPr>
+                    <a:xfrm>
+                      <a:off x="0" y="0"/>
+                      <a:ext cx="5760720" cy="1428115"/>
+                    </a:xfrm>
+                    <a:prstGeom prst="rect">
+                      <a:avLst/>
+                    </a:prstGeom>
+                  </pic:spPr>
+                </pic:pic>
+              </a:graphicData>
+            </a:graphic>
+          </wp:inline>
+        </w:drawing>
+      </w:r>
+    </w:p>
+    <w:p>
+      <w:pPr>
+        <w:spacing w:before="100" w:beforeAutospacing="1" w:after="100" w:afterAutospacing="1" w:line="240" w:lineRule="auto"/>
+        <w:rPr>
+          <w:rFonts w:ascii="Times New Roman" w:eastAsia="Times New Roman" w:hAnsi="Times New Roman" w:cs="Times New Roman"/>
+          <w:sz w:val="24"/>
+          <w:szCs w:val="24"/>
+          <w:lang w:eastAsia="tr-TR"/>
+        </w:rPr>
+      </w:pPr>
+      <w:r>
+        <w:rPr>
+          <w:rFonts w:ascii="Times New Roman" w:eastAsia="Times New Roman" w:hAnsi="Times New Roman" w:cs="Times New Roman"/>
+          <w:sz w:val="24"/>
+          <w:szCs w:val="24"/>
+          <w:lang w:eastAsia="tr-TR"/>
+        </w:rPr>
+        <w:t>Burada beş noktanın da Türkiye’nin Bulgaristan/Yunanistan sınırında mantıklı yerlerde görünmesini istiyoruz.</w:t>
+      </w:r>
+    </w:p>
+    <w:p>
+      <w:pPr>
+        <w:spacing w:before="100" w:beforeAutospacing="1" w:after="100" w:afterAutospacing="1" w:line="240" w:lineRule="auto"/>
+        <w:rPr>
+          <w:rFonts w:ascii="Times New Roman" w:eastAsia="Times New Roman" w:hAnsi="Times New Roman" w:cs="Times New Roman"/>
+          <w:sz w:val="24"/>
+          <w:szCs w:val="24"/>
+          <w:lang w:eastAsia="tr-TR"/>
+        </w:rPr>
+      </w:pPr>
+      <w:r>
+        <w:rPr>
+          <w:rFonts w:ascii="Times New Roman" w:eastAsia="Times New Roman" w:hAnsi="Times New Roman" w:cs="Times New Roman"/>
+          <w:sz w:val="24"/>
+          <w:szCs w:val="24"/>
+          <w:lang w:eastAsia="tr-TR"/>
+        </w:rPr>
+        <w:t xml:space="preserve">Sonra gerçek ilk </w:t>
+      </w:r>
+      <w:proofErr w:type="spellStart"/>
+      <w:r>
+        <w:rPr>
+          <w:rFonts w:ascii="Times New Roman" w:eastAsia="Times New Roman" w:hAnsi="Times New Roman" w:cs="Times New Roman"/>
+          <w:sz w:val="24"/>
+          <w:szCs w:val="24"/>
+          <w:lang w:eastAsia="tr-TR"/>
+        </w:rPr>
+        <w:t>accessibility</w:t>
+      </w:r>
+      <w:proofErr w:type="spellEnd"/>
+      <w:r>
+        <w:rPr>
+          <w:rFonts w:ascii="Times New Roman" w:eastAsia="Times New Roman" w:hAnsi="Times New Roman" w:cs="Times New Roman"/>
+          <w:sz w:val="24"/>
+          <w:szCs w:val="24"/>
+          <w:lang w:eastAsia="tr-TR"/>
+        </w:rPr>
+        <w:t xml:space="preserve"> değişkenimizi hesaplayacağız:</w:t>
+      </w:r>
+    </w:p>
+    <w:p>
+      <w:pPr>
+        <w:spacing w:after="0" w:line="240" w:lineRule="auto"/>
+        <w:rPr>
+          <w:rFonts w:ascii="Times New Roman" w:eastAsia="Times New Roman" w:hAnsi="Times New Roman" w:cs="Times New Roman"/>
+          <w:sz w:val="24"/>
+          <w:szCs w:val="24"/>
+          <w:lang w:eastAsia="tr-TR"/>
+        </w:rPr>
+      </w:pPr>
+      <w:proofErr w:type="spellStart"/>
+      <w:r>
+        <w:rPr>
+          <w:rFonts w:ascii="Times New Roman" w:eastAsia="Times New Roman" w:hAnsi="Times New Roman" w:cs="Times New Roman"/>
+          <w:sz w:val="24"/>
+          <w:szCs w:val="24"/>
+          <w:lang w:eastAsia="tr-TR"/>
+        </w:rPr>
+        <w:t>di</w:t>
+      </w:r>
+      <w:proofErr w:type="spellEnd"/>
+      <w:r>
+        <w:rPr>
+          <w:rFonts w:ascii="Times New Roman" w:eastAsia="Times New Roman" w:hAnsi="Times New Roman" w:cs="Times New Roman"/>
+          <w:sz w:val="24"/>
+          <w:szCs w:val="24"/>
+          <w:lang w:eastAsia="tr-TR"/>
+        </w:rPr>
+        <w:t>=</w:t>
+      </w:r>
+      <w:proofErr w:type="spellStart"/>
+      <w:r>
+        <w:rPr>
+          <w:rFonts w:ascii="Times New Roman" w:eastAsia="Times New Roman" w:hAnsi="Times New Roman" w:cs="Times New Roman"/>
+          <w:sz w:val="24"/>
+          <w:szCs w:val="24"/>
+          <w:lang w:eastAsia="tr-TR"/>
+        </w:rPr>
+        <w:t>min⁡gd</w:t>
+      </w:r>
+      <w:proofErr w:type="spellEnd"/>
+      <w:r>
+        <w:rPr>
+          <w:rFonts w:ascii="Times New Roman" w:eastAsia="Times New Roman" w:hAnsi="Times New Roman" w:cs="Times New Roman"/>
+          <w:sz w:val="24"/>
+          <w:szCs w:val="24"/>
+          <w:lang w:eastAsia="tr-TR"/>
+        </w:rPr>
+        <w:t>(</w:t>
+      </w:r>
+      <w:proofErr w:type="spellStart"/>
+      <w:proofErr w:type="gramStart"/>
+      <w:r>
+        <w:rPr>
+          <w:rFonts w:ascii="Times New Roman" w:eastAsia="Times New Roman" w:hAnsi="Times New Roman" w:cs="Times New Roman"/>
+          <w:sz w:val="24"/>
+          <w:szCs w:val="24"/>
+          <w:lang w:eastAsia="tr-TR"/>
+        </w:rPr>
+        <w:t>ci,g</w:t>
+      </w:r>
+      <w:proofErr w:type="spellEnd"/>
+      <w:proofErr w:type="gramEnd"/>
+      <w:r>
+        <w:rPr>
+          <w:rFonts w:ascii="Times New Roman" w:eastAsia="Times New Roman" w:hAnsi="Times New Roman" w:cs="Times New Roman"/>
+          <w:sz w:val="24"/>
+          <w:szCs w:val="24"/>
+          <w:lang w:eastAsia="tr-TR"/>
+        </w:rPr>
+        <w:t>)</w:t>
+      </w:r>
+      <w:proofErr w:type="spellStart"/>
+      <w:r>
+        <w:rPr>
+          <w:rFonts w:ascii="Times New Roman" w:eastAsia="Times New Roman" w:hAnsi="Times New Roman" w:cs="Times New Roman"/>
+          <w:sz w:val="24"/>
+          <w:szCs w:val="24"/>
+          <w:lang w:eastAsia="tr-TR"/>
+        </w:rPr>
+        <w:t>d_i</w:t>
+      </w:r>
+      <w:proofErr w:type="spellEnd"/>
+      <w:r>
+        <w:rPr>
+          <w:rFonts w:ascii="Times New Roman" w:eastAsia="Times New Roman" w:hAnsi="Times New Roman" w:cs="Times New Roman"/>
+          <w:sz w:val="24"/>
+          <w:szCs w:val="24"/>
+          <w:lang w:eastAsia="tr-TR"/>
+        </w:rPr>
+        <w:t>=\</w:t>
+      </w:r>
+      <w:proofErr w:type="spellStart"/>
+      <w:r>
+        <w:rPr>
+          <w:rFonts w:ascii="Times New Roman" w:eastAsia="Times New Roman" w:hAnsi="Times New Roman" w:cs="Times New Roman"/>
+          <w:sz w:val="24"/>
+          <w:szCs w:val="24"/>
+          <w:lang w:eastAsia="tr-TR"/>
+        </w:rPr>
+        <w:t>min_g</w:t>
+      </w:r>
+      <w:proofErr w:type="spellEnd"/>
+      <w:r>
+        <w:rPr>
+          <w:rFonts w:ascii="Times New Roman" w:eastAsia="Times New Roman" w:hAnsi="Times New Roman" w:cs="Times New Roman"/>
+          <w:sz w:val="24"/>
+          <w:szCs w:val="24"/>
+          <w:lang w:eastAsia="tr-TR"/>
+        </w:rPr>
+        <w:t xml:space="preserve"> d(</w:t>
+      </w:r>
+      <w:proofErr w:type="spellStart"/>
+      <w:r>
+        <w:rPr>
+          <w:rFonts w:ascii="Times New Roman" w:eastAsia="Times New Roman" w:hAnsi="Times New Roman" w:cs="Times New Roman"/>
+          <w:sz w:val="24"/>
+          <w:szCs w:val="24"/>
+          <w:lang w:eastAsia="tr-TR"/>
+        </w:rPr>
+        <w:t>c_i,g</w:t>
+      </w:r>
+      <w:proofErr w:type="spellEnd"/>
+      <w:r>
+        <w:rPr>
+          <w:rFonts w:ascii="Times New Roman" w:eastAsia="Times New Roman" w:hAnsi="Times New Roman" w:cs="Times New Roman"/>
+          <w:sz w:val="24"/>
+          <w:szCs w:val="24"/>
+          <w:lang w:eastAsia="tr-TR"/>
+        </w:rPr>
+        <w:t xml:space="preserve">) </w:t>
+      </w:r>
+    </w:p>
+    <w:p>
+      <w:pPr>
+        <w:spacing w:before="100" w:beforeAutospacing="1" w:after="100" w:afterAutospacing="1" w:line="240" w:lineRule="auto"/>
+        <w:rPr>
+          <w:rFonts w:ascii="Times New Roman" w:eastAsia="Times New Roman" w:hAnsi="Times New Roman" w:cs="Times New Roman"/>
+          <w:sz w:val="24"/>
+          <w:szCs w:val="24"/>
+          <w:lang w:eastAsia="tr-TR"/>
+        </w:rPr>
+      </w:pPr>
+      <w:r>
+        <w:rPr>
+          <w:rFonts w:ascii="Times New Roman" w:eastAsia="Times New Roman" w:hAnsi="Times New Roman" w:cs="Times New Roman"/>
+          <w:sz w:val="24"/>
+          <w:szCs w:val="24"/>
+          <w:lang w:eastAsia="tr-TR"/>
+        </w:rPr>
+        <w:t xml:space="preserve">Burada </w:t>
+      </w:r>
+      <w:proofErr w:type="spellStart"/>
+      <w:r>
+        <w:rPr>
+          <w:rFonts w:ascii="Times New Roman" w:eastAsia="Times New Roman" w:hAnsi="Times New Roman" w:cs="Times New Roman"/>
+          <w:sz w:val="24"/>
+          <w:szCs w:val="24"/>
+          <w:lang w:eastAsia="tr-TR"/>
+        </w:rPr>
+        <w:t>cic_i</w:t>
+      </w:r>
+      <w:proofErr w:type="spellEnd"/>
+      <w:r>
+        <w:rPr>
+          <w:rFonts w:ascii="Times New Roman" w:eastAsia="Times New Roman" w:hAnsi="Times New Roman" w:cs="Times New Roman"/>
+          <w:sz w:val="24"/>
+          <w:szCs w:val="24"/>
+          <w:lang w:eastAsia="tr-TR"/>
+        </w:rPr>
+        <w:t xml:space="preserve"> </w:t>
+      </w:r>
+      <w:proofErr w:type="spellStart"/>
+      <w:r>
+        <w:rPr>
+          <w:rFonts w:ascii="Times New Roman" w:eastAsia="Times New Roman" w:hAnsi="Times New Roman" w:cs="Times New Roman"/>
+          <w:sz w:val="24"/>
+          <w:szCs w:val="24"/>
+          <w:lang w:eastAsia="tr-TR"/>
+        </w:rPr>
+        <w:t>grid</w:t>
+      </w:r>
+      <w:proofErr w:type="spellEnd"/>
+      <w:r>
+        <w:rPr>
+          <w:rFonts w:ascii="Times New Roman" w:eastAsia="Times New Roman" w:hAnsi="Times New Roman" w:cs="Times New Roman"/>
+          <w:sz w:val="24"/>
+          <w:szCs w:val="24"/>
+          <w:lang w:eastAsia="tr-TR"/>
+        </w:rPr>
+        <w:t xml:space="preserve"> </w:t>
+      </w:r>
+      <w:proofErr w:type="spellStart"/>
+      <w:r>
+        <w:rPr>
+          <w:rFonts w:ascii="Times New Roman" w:eastAsia="Times New Roman" w:hAnsi="Times New Roman" w:cs="Times New Roman"/>
+          <w:sz w:val="24"/>
+          <w:szCs w:val="24"/>
+          <w:lang w:eastAsia="tr-TR"/>
+        </w:rPr>
+        <w:t>centroidi</w:t>
+      </w:r>
+      <w:proofErr w:type="spellEnd"/>
+      <w:r>
+        <w:rPr>
+          <w:rFonts w:ascii="Times New Roman" w:eastAsia="Times New Roman" w:hAnsi="Times New Roman" w:cs="Times New Roman"/>
+          <w:sz w:val="24"/>
+          <w:szCs w:val="24"/>
+          <w:lang w:eastAsia="tr-TR"/>
+        </w:rPr>
+        <w:t xml:space="preserve">, </w:t>
+      </w:r>
+      <w:proofErr w:type="spellStart"/>
+      <w:r>
+        <w:rPr>
+          <w:rFonts w:ascii="Times New Roman" w:eastAsia="Times New Roman" w:hAnsi="Times New Roman" w:cs="Times New Roman"/>
+          <w:sz w:val="24"/>
+          <w:szCs w:val="24"/>
+          <w:lang w:eastAsia="tr-TR"/>
+        </w:rPr>
+        <w:t>gg</w:t>
+      </w:r>
+      <w:proofErr w:type="spellEnd"/>
+      <w:r>
+        <w:rPr>
+          <w:rFonts w:ascii="Times New Roman" w:eastAsia="Times New Roman" w:hAnsi="Times New Roman" w:cs="Times New Roman"/>
+          <w:sz w:val="24"/>
+          <w:szCs w:val="24"/>
+          <w:lang w:eastAsia="tr-TR"/>
+        </w:rPr>
+        <w:t xml:space="preserve"> ise beş sınır kapısından biri.</w:t>
+      </w:r>
+    </w:p>
+    <w:p>
+      <w:pPr>
+        <w:spacing w:before="100" w:beforeAutospacing="1" w:after="100" w:afterAutospacing="1" w:line="240" w:lineRule="auto"/>
+        <w:rPr>
+          <w:rFonts w:ascii="Times New Roman" w:eastAsia="Times New Roman" w:hAnsi="Times New Roman" w:cs="Times New Roman"/>
+          <w:sz w:val="24"/>
+          <w:szCs w:val="24"/>
+          <w:lang w:eastAsia="tr-TR"/>
+        </w:rPr>
+      </w:pPr>
+      <w:r>
+        <w:rPr>
+          <w:rFonts w:ascii="Times New Roman" w:eastAsia="Times New Roman" w:hAnsi="Times New Roman" w:cs="Times New Roman"/>
+          <w:sz w:val="24"/>
+          <w:szCs w:val="24"/>
+          <w:lang w:eastAsia="tr-TR"/>
+        </w:rPr>
+        <w:t xml:space="preserve">Bunun sonucunda 19.001 </w:t>
+      </w:r>
+      <w:proofErr w:type="spellStart"/>
+      <w:r>
+        <w:rPr>
+          <w:rFonts w:ascii="Times New Roman" w:eastAsia="Times New Roman" w:hAnsi="Times New Roman" w:cs="Times New Roman"/>
+          <w:sz w:val="24"/>
+          <w:szCs w:val="24"/>
+          <w:lang w:eastAsia="tr-TR"/>
+        </w:rPr>
+        <w:t>grid</w:t>
+      </w:r>
+      <w:proofErr w:type="spellEnd"/>
+      <w:r>
+        <w:rPr>
+          <w:rFonts w:ascii="Times New Roman" w:eastAsia="Times New Roman" w:hAnsi="Times New Roman" w:cs="Times New Roman"/>
+          <w:sz w:val="24"/>
+          <w:szCs w:val="24"/>
+          <w:lang w:eastAsia="tr-TR"/>
+        </w:rPr>
+        <w:t xml:space="preserve"> için:</w:t>
+      </w:r>
+    </w:p>
+    <w:p>
+      <w:pPr>
+        <w:tabs>
+          <w:tab w:val="left" w:pos="916"/>
+          <w:tab w:val="left" w:pos="1832"/>
+          <w:tab w:val="left" w:pos="2748"/>
+          <w:tab w:val="left" w:pos="3664"/>
+          <w:tab w:val="left" w:pos="4580"/>
+          <w:tab w:val="left" w:pos="5496"/>
+          <w:tab w:val="left" w:pos="6412"/>
+          <w:tab w:val="left" w:pos="7328"/>
+          <w:tab w:val="left" w:pos="8244"/>
+          <w:tab w:val="left" w:pos="9160"/>
+          <w:tab w:val="left" w:pos="10076"/>
+          <w:tab w:val="left" w:pos="10992"/>
+          <w:tab w:val="left" w:pos="11908"/>
+          <w:tab w:val="left" w:pos="12824"/>
+          <w:tab w:val="left" w:pos="13740"/>
+          <w:tab w:val="left" w:pos="14656"/>
+        </w:tabs>
+        <w:spacing w:after="0" w:line="240" w:lineRule="auto"/>
+        <w:rPr>
+          <w:rFonts w:ascii="Courier New" w:eastAsia="Times New Roman" w:hAnsi="Courier New" w:cs="Courier New"/>
+          <w:sz w:val="20"/>
+          <w:szCs w:val="20"/>
+          <w:lang w:eastAsia="tr-TR"/>
+        </w:rPr>
+      </w:pPr>
+      <w:proofErr w:type="spellStart"/>
+      <w:r>
+        <w:rPr>
+          <w:rFonts w:ascii="Courier New" w:eastAsia="Times New Roman" w:hAnsi="Courier New" w:cs="Courier New"/>
+          <w:sz w:val="20"/>
+          <w:szCs w:val="20"/>
+          <w:lang w:eastAsia="tr-TR"/>
+        </w:rPr>
+        <w:t>grid_id</w:t>
+      </w:r>
+      <w:proofErr w:type="spellEnd"/>
+    </w:p>
+    <w:p>
+      <w:pPr>
+        <w:tabs>
+          <w:tab w:val="left" w:pos="916"/>
+          <w:tab w:val="left" w:pos="1832"/>
+          <w:tab w:val="left" w:pos="2748"/>
+          <w:tab w:val="left" w:pos="3664"/>
+          <w:tab w:val="left" w:pos="4580"/>
+          <w:tab w:val="left" w:pos="5496"/>
+          <w:tab w:val="left" w:pos="6412"/>
+          <w:tab w:val="left" w:pos="7328"/>
+          <w:tab w:val="left" w:pos="8244"/>
+          <w:tab w:val="left" w:pos="9160"/>
+          <w:tab w:val="left" w:pos="10076"/>
+          <w:tab w:val="left" w:pos="10992"/>
+          <w:tab w:val="left" w:pos="11908"/>
+          <w:tab w:val="left" w:pos="12824"/>
+          <w:tab w:val="left" w:pos="13740"/>
+          <w:tab w:val="left" w:pos="14656"/>
+        </w:tabs>
+        <w:spacing w:after="0" w:line="240" w:lineRule="auto"/>
+        <w:rPr>
+          <w:rFonts w:ascii="Courier New" w:eastAsia="Times New Roman" w:hAnsi="Courier New" w:cs="Courier New"/>
+          <w:sz w:val="20"/>
+          <w:szCs w:val="20"/>
+          <w:lang w:eastAsia="tr-TR"/>
+        </w:rPr>
+      </w:pPr>
+      <w:proofErr w:type="spellStart"/>
+      <w:r>
+        <w:rPr>
+          <w:rFonts w:ascii="Courier New" w:eastAsia="Times New Roman" w:hAnsi="Courier New" w:cs="Courier New"/>
+          <w:sz w:val="20"/>
+          <w:szCs w:val="20"/>
+          <w:lang w:eastAsia="tr-TR"/>
+        </w:rPr>
+        <w:t>nearest_gate</w:t>
+      </w:r>
+      <w:proofErr w:type="spellEnd"/>
+    </w:p>
+    <w:p>
+      <w:pPr>
+        <w:tabs>
+          <w:tab w:val="left" w:pos="916"/>
+          <w:tab w:val="left" w:pos="1832"/>
+          <w:tab w:val="left" w:pos="2748"/>
+          <w:tab w:val="left" w:pos="3664"/>
+          <w:tab w:val="left" w:pos="4580"/>
+          <w:tab w:val="left" w:pos="5496"/>
+          <w:tab w:val="left" w:pos="6412"/>
+          <w:tab w:val="left" w:pos="7328"/>
+          <w:tab w:val="left" w:pos="8244"/>
+          <w:tab w:val="left" w:pos="9160"/>
+          <w:tab w:val="left" w:pos="10076"/>
+          <w:tab w:val="left" w:pos="10992"/>
+          <w:tab w:val="left" w:pos="11908"/>
+          <w:tab w:val="left" w:pos="12824"/>
+          <w:tab w:val="left" w:pos="13740"/>
+          <w:tab w:val="left" w:pos="14656"/>
+        </w:tabs>
+        <w:spacing w:after="0" w:line="240" w:lineRule="auto"/>
+        <w:rPr>
+          <w:rFonts w:ascii="Courier New" w:eastAsia="Times New Roman" w:hAnsi="Courier New" w:cs="Courier New"/>
+          <w:sz w:val="20"/>
+          <w:szCs w:val="20"/>
+          <w:lang w:eastAsia="tr-TR"/>
+        </w:rPr>
+      </w:pPr>
+      <w:proofErr w:type="spellStart"/>
+      <w:r>
+        <w:rPr>
+          <w:rFonts w:ascii="Courier New" w:eastAsia="Times New Roman" w:hAnsi="Courier New" w:cs="Courier New"/>
+          <w:sz w:val="20"/>
+          <w:szCs w:val="20"/>
+          <w:lang w:eastAsia="tr-TR"/>
+        </w:rPr>
+        <w:t>nearest_border_country</w:t>
+      </w:r>
+      <w:proofErr w:type="spellEnd"/>
+    </w:p>
+    <w:p>
+      <w:pPr>
+        <w:tabs>
+          <w:tab w:val="left" w:pos="916"/>
+          <w:tab w:val="left" w:pos="1832"/>
+          <w:tab w:val="left" w:pos="2748"/>
+          <w:tab w:val="left" w:pos="3664"/>
+          <w:tab w:val="left" w:pos="4580"/>
+          <w:tab w:val="left" w:pos="5496"/>
+          <w:tab w:val="left" w:pos="6412"/>
+          <w:tab w:val="left" w:pos="7328"/>
+          <w:tab w:val="left" w:pos="8244"/>
+          <w:tab w:val="left" w:pos="9160"/>
+          <w:tab w:val="left" w:pos="10076"/>
+          <w:tab w:val="left" w:pos="10992"/>
+          <w:tab w:val="left" w:pos="11908"/>
+          <w:tab w:val="left" w:pos="12824"/>
+          <w:tab w:val="left" w:pos="13740"/>
+          <w:tab w:val="left" w:pos="14656"/>
+        </w:tabs>
+        <w:spacing w:after="0" w:line="240" w:lineRule="auto"/>
+        <w:rPr>
+          <w:rFonts w:ascii="Courier New" w:eastAsia="Times New Roman" w:hAnsi="Courier New" w:cs="Courier New"/>
+          <w:sz w:val="20"/>
+          <w:szCs w:val="20"/>
+          <w:lang w:eastAsia="tr-TR"/>
+        </w:rPr>
+      </w:pPr>
+      <w:proofErr w:type="spellStart"/>
+      <w:r>
+        <w:rPr>
+          <w:rFonts w:ascii="Courier New" w:eastAsia="Times New Roman" w:hAnsi="Courier New" w:cs="Courier New"/>
+          <w:sz w:val="20"/>
+          <w:szCs w:val="20"/>
+          <w:lang w:eastAsia="tr-TR"/>
+        </w:rPr>
+        <w:t>euclidean_distance_km</w:t>
+      </w:r>
+      <w:proofErr w:type="spellEnd"/>
+    </w:p>
+    <w:p>
+      <w:pPr>
+        <w:spacing w:before="100" w:beforeAutospacing="1" w:after="100" w:afterAutospacing="1" w:line="240" w:lineRule="auto"/>
+        <w:rPr>
+          <w:rFonts w:ascii="Times New Roman" w:eastAsia="Times New Roman" w:hAnsi="Times New Roman" w:cs="Times New Roman"/>
+          <w:sz w:val="24"/>
+          <w:szCs w:val="24"/>
+          <w:lang w:eastAsia="tr-TR"/>
+        </w:rPr>
+      </w:pPr>
+      <w:proofErr w:type="gramStart"/>
+      <w:r>
+        <w:rPr>
+          <w:rFonts w:ascii="Times New Roman" w:eastAsia="Times New Roman" w:hAnsi="Times New Roman" w:cs="Times New Roman"/>
+          <w:sz w:val="24"/>
+          <w:szCs w:val="24"/>
+          <w:lang w:eastAsia="tr-TR"/>
+        </w:rPr>
+        <w:t>üreteceğiz</w:t>
+      </w:r>
+      <w:proofErr w:type="gramEnd"/>
+      <w:r>
+        <w:rPr>
+          <w:rFonts w:ascii="Times New Roman" w:eastAsia="Times New Roman" w:hAnsi="Times New Roman" w:cs="Times New Roman"/>
+          <w:sz w:val="24"/>
+          <w:szCs w:val="24"/>
+          <w:lang w:eastAsia="tr-TR"/>
+        </w:rPr>
+        <w:t>.</w:t>
+      </w:r>
+    </w:p>
+    <w:p>
+      <w:pPr>
+        <w:spacing w:before="100" w:beforeAutospacing="1" w:after="100" w:afterAutospacing="1" w:line="240" w:lineRule="auto"/>
+        <w:rPr>
+          <w:rFonts w:ascii="Times New Roman" w:eastAsia="Times New Roman" w:hAnsi="Times New Roman" w:cs="Times New Roman"/>
+          <w:sz w:val="24"/>
+          <w:szCs w:val="24"/>
+          <w:lang w:eastAsia="tr-TR"/>
+        </w:rPr>
+      </w:pPr>
+      <w:r>
+        <w:rPr>
+          <w:rFonts w:ascii="Times New Roman" w:eastAsia="Times New Roman" w:hAnsi="Times New Roman" w:cs="Times New Roman"/>
+          <w:sz w:val="24"/>
+          <w:szCs w:val="24"/>
+          <w:lang w:eastAsia="tr-TR"/>
+        </w:rPr>
+        <w:t xml:space="preserve">Önemli metodolojik not: </w:t>
+      </w:r>
+      <w:proofErr w:type="spellStart"/>
+      <w:r>
+        <w:rPr>
+          <w:rFonts w:ascii="Courier New" w:eastAsia="Times New Roman" w:hAnsi="Courier New" w:cs="Courier New"/>
+          <w:sz w:val="20"/>
+          <w:szCs w:val="20"/>
+          <w:lang w:eastAsia="tr-TR"/>
+        </w:rPr>
+        <w:t>euclidean_distance_km</w:t>
+      </w:r>
+      <w:proofErr w:type="spellEnd"/>
+      <w:r>
+        <w:rPr>
+          <w:rFonts w:ascii="Times New Roman" w:eastAsia="Times New Roman" w:hAnsi="Times New Roman" w:cs="Times New Roman"/>
+          <w:sz w:val="24"/>
+          <w:szCs w:val="24"/>
+          <w:lang w:eastAsia="tr-TR"/>
+        </w:rPr>
+        <w:t xml:space="preserve"> ana sonuç değişkeni olmayacak; bu </w:t>
+      </w:r>
+      <w:proofErr w:type="spellStart"/>
+      <w:r>
+        <w:rPr>
+          <w:rFonts w:ascii="Times New Roman" w:eastAsia="Times New Roman" w:hAnsi="Times New Roman" w:cs="Times New Roman"/>
+          <w:sz w:val="24"/>
+          <w:szCs w:val="24"/>
+          <w:lang w:eastAsia="tr-TR"/>
+        </w:rPr>
+        <w:t>baseline</w:t>
+      </w:r>
+      <w:proofErr w:type="spellEnd"/>
+      <w:r>
+        <w:rPr>
+          <w:rFonts w:ascii="Times New Roman" w:eastAsia="Times New Roman" w:hAnsi="Times New Roman" w:cs="Times New Roman"/>
+          <w:sz w:val="24"/>
+          <w:szCs w:val="24"/>
+          <w:lang w:eastAsia="tr-TR"/>
+        </w:rPr>
+        <w:t xml:space="preserve"> </w:t>
+      </w:r>
+      <w:proofErr w:type="spellStart"/>
+      <w:r>
+        <w:rPr>
+          <w:rFonts w:ascii="Times New Roman" w:eastAsia="Times New Roman" w:hAnsi="Times New Roman" w:cs="Times New Roman"/>
+          <w:sz w:val="24"/>
+          <w:szCs w:val="24"/>
+          <w:lang w:eastAsia="tr-TR"/>
+        </w:rPr>
+        <w:t>accessibility</w:t>
+      </w:r>
+      <w:proofErr w:type="spellEnd"/>
+      <w:r>
+        <w:rPr>
+          <w:rFonts w:ascii="Times New Roman" w:eastAsia="Times New Roman" w:hAnsi="Times New Roman" w:cs="Times New Roman"/>
+          <w:sz w:val="24"/>
+          <w:szCs w:val="24"/>
+          <w:lang w:eastAsia="tr-TR"/>
+        </w:rPr>
+        <w:t xml:space="preserve"> ölçüsü. Esas </w:t>
+      </w:r>
+      <w:proofErr w:type="spellStart"/>
+      <w:r>
+        <w:rPr>
+          <w:rFonts w:ascii="Times New Roman" w:eastAsia="Times New Roman" w:hAnsi="Times New Roman" w:cs="Times New Roman"/>
+          <w:sz w:val="24"/>
+          <w:szCs w:val="24"/>
+          <w:lang w:eastAsia="tr-TR"/>
+        </w:rPr>
+        <w:t>treatment’ı</w:t>
+      </w:r>
+      <w:proofErr w:type="spellEnd"/>
+      <w:r>
+        <w:rPr>
+          <w:rFonts w:ascii="Times New Roman" w:eastAsia="Times New Roman" w:hAnsi="Times New Roman" w:cs="Times New Roman"/>
+          <w:sz w:val="24"/>
+          <w:szCs w:val="24"/>
+          <w:lang w:eastAsia="tr-TR"/>
+        </w:rPr>
+        <w:t xml:space="preserve"> daha sonra karayolu erişim süresi/mesafesiyle kuracağız. Böylece “Kapıkule’ye 50 km kuş uçuşu mesafede ama yol ağı nedeniyle 85 km sürüş mesafesinde” gibi farkları yakalayabiliriz.</w:t>
+      </w:r>
+    </w:p>
+    <w:p>
+      <w:r>
+        <w:lastRenderedPageBreak/>
+        <w:drawing>
+          <wp:inline distT="0" distB="0" distL="0" distR="0" wp14:anchorId="17D8D850" wp14:editId="7E70AFFD">
+            <wp:extent cx="5760720" cy="2868295"/>
+            <wp:effectExtent l="0" t="0" r="0" b="8255"/>
+            <wp:docPr id="3" name="Resim 3"/>
+            <wp:cNvGraphicFramePr>
+              <a:graphicFrameLocks xmlns:a="http://schemas.openxmlformats.org/drawingml/2006/main" noChangeAspect="1"/>
+            </wp:cNvGraphicFramePr>
+            <a:graphic xmlns:a="http://schemas.openxmlformats.org/drawingml/2006/main">
+              <a:graphicData uri="http://schemas.openxmlformats.org/drawingml/2006/picture">
+                <pic:pic xmlns:pic="http://schemas.openxmlformats.org/drawingml/2006/picture">
+                  <pic:nvPicPr>
+                    <pic:cNvPr id="1" name=""/>
+                    <pic:cNvPicPr/>
+                  </pic:nvPicPr>
+                  <pic:blipFill>
+                    <a:blip r:embed="rId6"/>
+                    <a:stretch>
+                      <a:fillRect/>
+                    </a:stretch>
+                  </pic:blipFill>
+                  <pic:spPr>
+                    <a:xfrm>
+                      <a:off x="0" y="0"/>
+                      <a:ext cx="5760720" cy="2868295"/>
+                    </a:xfrm>
+                    <a:prstGeom prst="rect">
+                      <a:avLst/>
+                    </a:prstGeom>
+                  </pic:spPr>
+                </pic:pic>
+              </a:graphicData>
+            </a:graphic>
+          </wp:inline>
+        </w:drawing>
+      </w:r>
+    </w:p>
+    <w:p>
+      <w:pPr>
+        <w:pStyle w:val="NormalWeb"/>
+      </w:pPr>
+      <w:r>
+        <w:t xml:space="preserve">Bu dağılım genel olarak mantıklı görünüyor ve </w:t>
+      </w:r>
+      <w:r>
+        <w:rPr>
+          <w:rStyle w:val="HTMLKodu"/>
+        </w:rPr>
+        <w:t>03_border_accessibility</w:t>
+      </w:r>
+      <w:r>
+        <w:t xml:space="preserve"> için temel kuş uçuşu erişilebilirlik değişkeni başarılı şekilde oluşmuş.</w:t>
+      </w:r>
+    </w:p>
+    <w:p>
+      <w:pPr>
+        <w:pStyle w:val="NormalWeb"/>
+      </w:pPr>
+      <w:r>
+        <w:t xml:space="preserve">En yakın kapı dağılımında </w:t>
+      </w:r>
+      <w:proofErr w:type="spellStart"/>
+      <w:r>
+        <w:t>Dereköy</w:t>
+      </w:r>
+      <w:proofErr w:type="spellEnd"/>
+      <w:r>
+        <w:t xml:space="preserve"> ve İpsala’nın baskın olması coğrafi olarak anlaşılır; çünkü Tekirdağ ve Kırklareli’nin geniş iç alanlarında en yakın geçiş noktaları bunlar olabiliyor. Bulgaristan ve Yunanistan toplamlarının neredeyse yarı yarıya çıkması da çalışma alanının iki sınıra yayılan yapısıyla uyumlu:</w:t>
+      </w:r>
+    </w:p>
+    <w:p>
+      <w:pPr>
+        <w:pStyle w:val="HTMLncedenBiimlendirilmi"/>
+        <w:rPr>
+          <w:rStyle w:val="HTMLKodu"/>
+        </w:rPr>
+      </w:pPr>
+      <w:proofErr w:type="spellStart"/>
+      <w:r>
+        <w:rPr>
+          <w:rStyle w:val="HTMLKodu"/>
+        </w:rPr>
+        <w:t>Bulgaria</w:t>
+      </w:r>
+      <w:proofErr w:type="spellEnd"/>
+      <w:r>
+        <w:rPr>
+          <w:rStyle w:val="HTMLKodu"/>
+        </w:rPr>
+        <w:t>: 9538</w:t>
+      </w:r>
+    </w:p>
+    <w:p>
+      <w:pPr>
+        <w:pStyle w:val="HTMLncedenBiimlendirilmi"/>
+      </w:pPr>
+      <w:proofErr w:type="spellStart"/>
+      <w:r>
+        <w:rPr>
+          <w:rStyle w:val="HTMLKodu"/>
+        </w:rPr>
+        <w:t>Greece</w:t>
+      </w:r>
+      <w:proofErr w:type="spellEnd"/>
+      <w:r>
+        <w:rPr>
+          <w:rStyle w:val="HTMLKodu"/>
+        </w:rPr>
+        <w:t>:   9463</w:t>
+      </w:r>
+    </w:p>
+    <w:p>
+      <w:pPr>
+        <w:pStyle w:val="NormalWeb"/>
+      </w:pPr>
+      <w:r>
+        <w:t>Mesafe dağılımı da makul:</w:t>
+      </w:r>
+    </w:p>
+    <w:p>
+      <w:pPr>
+        <w:pStyle w:val="HTMLncedenBiimlendirilmi"/>
+        <w:rPr>
+          <w:rStyle w:val="HTMLKodu"/>
+        </w:rPr>
+      </w:pPr>
+      <w:proofErr w:type="spellStart"/>
+      <w:r>
+        <w:rPr>
+          <w:rStyle w:val="HTMLKodu"/>
+        </w:rPr>
+        <w:t>mean</w:t>
+      </w:r>
+      <w:proofErr w:type="spellEnd"/>
+      <w:r>
+        <w:rPr>
+          <w:rStyle w:val="HTMLKodu"/>
+        </w:rPr>
+        <w:t xml:space="preserve">   = 48.15 km</w:t>
+      </w:r>
+    </w:p>
+    <w:p>
+      <w:pPr>
+        <w:pStyle w:val="HTMLncedenBiimlendirilmi"/>
+        <w:rPr>
+          <w:rStyle w:val="HTMLKodu"/>
+        </w:rPr>
+      </w:pPr>
+      <w:proofErr w:type="spellStart"/>
+      <w:r>
+        <w:rPr>
+          <w:rStyle w:val="HTMLKodu"/>
+        </w:rPr>
+        <w:t>median</w:t>
+      </w:r>
+      <w:proofErr w:type="spellEnd"/>
+      <w:r>
+        <w:rPr>
+          <w:rStyle w:val="HTMLKodu"/>
+        </w:rPr>
+        <w:t xml:space="preserve"> = 43.80 km</w:t>
+      </w:r>
+    </w:p>
+    <w:p>
+      <w:pPr>
+        <w:pStyle w:val="HTMLncedenBiimlendirilmi"/>
+        <w:rPr>
+          <w:rStyle w:val="HTMLKodu"/>
+        </w:rPr>
+      </w:pPr>
+      <w:proofErr w:type="spellStart"/>
+      <w:r>
+        <w:rPr>
+          <w:rStyle w:val="HTMLKodu"/>
+        </w:rPr>
+        <w:t>min</w:t>
+      </w:r>
+      <w:proofErr w:type="spellEnd"/>
+      <w:r>
+        <w:rPr>
+          <w:rStyle w:val="HTMLKodu"/>
+        </w:rPr>
+        <w:t xml:space="preserve">    = 0.34 km</w:t>
+      </w:r>
+    </w:p>
+    <w:p>
+      <w:pPr>
+        <w:pStyle w:val="HTMLncedenBiimlendirilmi"/>
+      </w:pPr>
+      <w:proofErr w:type="spellStart"/>
+      <w:r>
+        <w:rPr>
+          <w:rStyle w:val="HTMLKodu"/>
+        </w:rPr>
+        <w:t>max</w:t>
+      </w:r>
+      <w:proofErr w:type="spellEnd"/>
+      <w:r>
+        <w:rPr>
+          <w:rStyle w:val="HTMLKodu"/>
+        </w:rPr>
+        <w:t xml:space="preserve">    = 118.07 km</w:t>
+      </w:r>
+    </w:p>
+    <w:p>
+      <w:pPr>
+        <w:pStyle w:val="NormalWeb"/>
+      </w:pPr>
+      <w:r>
+        <w:t xml:space="preserve">Özellikle minimumun sıfıra yakın ama sıfır olmaması iyi; </w:t>
+      </w:r>
+      <w:proofErr w:type="spellStart"/>
+      <w:r>
+        <w:t>grid</w:t>
+      </w:r>
+      <w:proofErr w:type="spellEnd"/>
+      <w:r>
+        <w:t xml:space="preserve"> </w:t>
+      </w:r>
+      <w:proofErr w:type="spellStart"/>
+      <w:r>
+        <w:t>centroidi</w:t>
+      </w:r>
+      <w:proofErr w:type="spellEnd"/>
+      <w:r>
+        <w:t xml:space="preserve"> sınır kapısının tam üstüne denk gelmemiş. Maksimum 118 km de iç kontrol alanı açısından yeterli bir erişilebilirlik </w:t>
+      </w:r>
+      <w:proofErr w:type="spellStart"/>
+      <w:r>
+        <w:t>gradyanı</w:t>
+      </w:r>
+      <w:proofErr w:type="spellEnd"/>
+      <w:r>
+        <w:t xml:space="preserve"> veriyor.</w:t>
+      </w:r>
+    </w:p>
+    <w:p>
+      <w:pPr>
+        <w:pStyle w:val="NormalWeb"/>
+      </w:pPr>
+      <w:r>
+        <w:t xml:space="preserve">Kapıkule’nin yalnızca 173 </w:t>
+      </w:r>
+      <w:proofErr w:type="spellStart"/>
+      <w:r>
+        <w:t>grid</w:t>
+      </w:r>
+      <w:proofErr w:type="spellEnd"/>
+      <w:r>
+        <w:t xml:space="preserve"> için en yakın kapı çıkması ilk bakışta az görünebilir ama bu bir hata işareti olmak zorunda değil. Kapıkule, </w:t>
+      </w:r>
+      <w:proofErr w:type="spellStart"/>
+      <w:r>
+        <w:t>Pazarkule</w:t>
+      </w:r>
+      <w:proofErr w:type="spellEnd"/>
+      <w:r>
+        <w:t xml:space="preserve"> ve Hamzabeyli’ye göre </w:t>
+      </w:r>
+      <w:proofErr w:type="spellStart"/>
+      <w:r>
+        <w:t>Voronoi</w:t>
+      </w:r>
+      <w:proofErr w:type="spellEnd"/>
+      <w:r>
+        <w:t xml:space="preserve"> alanı daha dar kalmış olabilir. Yine de hakemlik açısından bunu haritada mutlaka kontrol edeceğiz. Yani </w:t>
+      </w:r>
+      <w:proofErr w:type="spellStart"/>
+      <w:r>
+        <w:rPr>
+          <w:rStyle w:val="HTMLKodu"/>
+        </w:rPr>
+        <w:t>nearest_gate</w:t>
+      </w:r>
+      <w:proofErr w:type="spellEnd"/>
+      <w:r>
+        <w:t xml:space="preserve"> </w:t>
+      </w:r>
+      <w:proofErr w:type="spellStart"/>
+      <w:r>
+        <w:t>zonlarını</w:t>
+      </w:r>
+      <w:proofErr w:type="spellEnd"/>
+      <w:r>
+        <w:t xml:space="preserve"> renkli bir </w:t>
+      </w:r>
+      <w:proofErr w:type="spellStart"/>
+      <w:r>
+        <w:t>Voronoi</w:t>
+      </w:r>
+      <w:proofErr w:type="spellEnd"/>
+      <w:r>
+        <w:t>-benzeri haritada görüp Kapıkule’nin alanının gerçekten dar olup olmadığını görsel olarak doğrulamak iyi olur.</w:t>
+      </w:r>
+    </w:p>
+    <w:p>
       <w:bookmarkStart w:id="0" w:name="_GoBack"/>
       <w:bookmarkEnd w:id="0"/>
     </w:p>
@@ -474,6 +2078,105 @@
     <w:semiHidden/>
     <w:unhideWhenUsed/>
   </w:style>
+  <w:style w:type="character" w:styleId="HTMLKodu">
+    <w:name w:val="HTML Code"/>
+    <w:basedOn w:val="VarsaylanParagrafYazTipi"/>
+    <w:uiPriority w:val="99"/>
+    <w:semiHidden/>
+    <w:unhideWhenUsed/>
+    <w:rsid w:val="008E7E43"/>
+    <w:rPr>
+      <w:rFonts w:ascii="Courier New" w:eastAsia="Times New Roman" w:hAnsi="Courier New" w:cs="Courier New"/>
+      <w:sz w:val="20"/>
+      <w:szCs w:val="20"/>
+    </w:rPr>
+  </w:style>
+  <w:style w:type="paragraph" w:styleId="NormalWeb">
+    <w:name w:val="Normal (Web)"/>
+    <w:basedOn w:val="Normal"/>
+    <w:uiPriority w:val="99"/>
+    <w:semiHidden/>
+    <w:unhideWhenUsed/>
+    <w:rsid w:val="008E7E43"/>
+    <w:pPr>
+      <w:spacing w:before="100" w:beforeAutospacing="1" w:after="100" w:afterAutospacing="1" w:line="240" w:lineRule="auto"/>
+    </w:pPr>
+    <w:rPr>
+      <w:rFonts w:ascii="Times New Roman" w:eastAsia="Times New Roman" w:hAnsi="Times New Roman" w:cs="Times New Roman"/>
+      <w:sz w:val="24"/>
+      <w:szCs w:val="24"/>
+      <w:lang w:eastAsia="tr-TR"/>
+    </w:rPr>
+  </w:style>
+  <w:style w:type="paragraph" w:customStyle="1" w:styleId="pdq2pgselectionanchorcontainer">
+    <w:name w:val="pdq2pg_selectionanchorcontainer"/>
+    <w:basedOn w:val="Normal"/>
+    <w:rsid w:val="00645D7C"/>
+    <w:pPr>
+      <w:spacing w:before="100" w:beforeAutospacing="1" w:after="100" w:afterAutospacing="1" w:line="240" w:lineRule="auto"/>
+    </w:pPr>
+    <w:rPr>
+      <w:rFonts w:ascii="Times New Roman" w:eastAsia="Times New Roman" w:hAnsi="Times New Roman" w:cs="Times New Roman"/>
+      <w:sz w:val="24"/>
+      <w:szCs w:val="24"/>
+      <w:lang w:eastAsia="tr-TR"/>
+    </w:rPr>
+  </w:style>
+  <w:style w:type="character" w:customStyle="1" w:styleId="katex">
+    <w:name w:val="katex"/>
+    <w:basedOn w:val="VarsaylanParagrafYazTipi"/>
+    <w:rsid w:val="00645D7C"/>
+  </w:style>
+  <w:style w:type="paragraph" w:styleId="HTMLncedenBiimlendirilmi">
+    <w:name w:val="HTML Preformatted"/>
+    <w:basedOn w:val="Normal"/>
+    <w:link w:val="HTMLncedenBiimlendirilmiChar"/>
+    <w:uiPriority w:val="99"/>
+    <w:semiHidden/>
+    <w:unhideWhenUsed/>
+    <w:rsid w:val="00645D7C"/>
+    <w:pPr>
+      <w:tabs>
+        <w:tab w:val="left" w:pos="916"/>
+        <w:tab w:val="left" w:pos="1832"/>
+        <w:tab w:val="left" w:pos="2748"/>
+        <w:tab w:val="left" w:pos="3664"/>
+        <w:tab w:val="left" w:pos="4580"/>
+        <w:tab w:val="left" w:pos="5496"/>
+        <w:tab w:val="left" w:pos="6412"/>
+        <w:tab w:val="left" w:pos="7328"/>
+        <w:tab w:val="left" w:pos="8244"/>
+        <w:tab w:val="left" w:pos="9160"/>
+        <w:tab w:val="left" w:pos="10076"/>
+        <w:tab w:val="left" w:pos="10992"/>
+        <w:tab w:val="left" w:pos="11908"/>
+        <w:tab w:val="left" w:pos="12824"/>
+        <w:tab w:val="left" w:pos="13740"/>
+        <w:tab w:val="left" w:pos="14656"/>
+      </w:tabs>
+      <w:spacing w:after="0" w:line="240" w:lineRule="auto"/>
+    </w:pPr>
+    <w:rPr>
+      <w:rFonts w:ascii="Courier New" w:eastAsia="Times New Roman" w:hAnsi="Courier New" w:cs="Courier New"/>
+      <w:sz w:val="20"/>
+      <w:szCs w:val="20"/>
+      <w:lang w:eastAsia="tr-TR"/>
+    </w:rPr>
+  </w:style>
+  <w:style w:type="character" w:customStyle="1" w:styleId="HTMLncedenBiimlendirilmiChar">
+    <w:name w:val="HTML Önceden Biçimlendirilmiş Char"/>
+    <w:basedOn w:val="VarsaylanParagrafYazTipi"/>
+    <w:link w:val="HTMLncedenBiimlendirilmi"/>
+    <w:uiPriority w:val="99"/>
+    <w:semiHidden/>
+    <w:rsid w:val="00645D7C"/>
+    <w:rPr>
+      <w:rFonts w:ascii="Courier New" w:eastAsia="Times New Roman" w:hAnsi="Courier New" w:cs="Courier New"/>
+      <w:sz w:val="20"/>
+      <w:szCs w:val="20"/>
+      <w:lang w:eastAsia="tr-TR"/>
+    </w:rPr>
+  </w:style>
 </w:styles>
 </file>
 

</xml_diff>